<commit_message>
feat: opt-out do dicionário + sincroniza EULA v0.3 aprovada pelo advogado
- EULA: incorpora Revisão Jurídica (nome completo "Caio Fabiano da Silva
  Costa", foro "Cabo de Santo Agostinho/PE"), agora v0.3
- Propaga nome e foro confirmados em Termos de Uso e Política de Privacidade
  (v0.2, ainda aguardando revisão jurídica formal do restante do texto)
- Nova opção no Setup: desativar contribuição automática ao dicionário
  colaborativo (checkbox → config local → 4º argumento de CLI do tradutor.py
  → gate em traduzir_lista). Atende recomendação do advogado.
- Política do Dicionário atualizada refletindo que o opt-out já existe
</commit_message>
<xml_diff>
--- a/Políticas/EULA_Campfire_Tradutor.docx
+++ b/Políticas/EULA_Campfire_Tradutor.docx
@@ -30,13 +30,13 @@
           <w:sz w:val="20"/>
           <w:szCs w:val="20"/>
         </w:rPr>
-        <w:t xml:space="preserve">Versão: v0.2 — Revisão Técnica  ·  Data: [DATA]</w:t>
+        <w:t xml:space="preserve">Versão: v0.3 — Revisão Jurídica  ·  Data: 31/07/2026</w:t>
       </w:r>
     </w:p>
     <w:p>
       <w:pPr>
         <w:pBdr>
-          <w:bottom w:val="single" w:color="B00000" w:sz="6" w:space="4"/>
+          <w:bottom w:val="single" w:color="1A7A1A" w:sz="6" w:space="4"/>
         </w:pBdr>
         <w:spacing w:after="300"/>
       </w:pPr>
@@ -45,26 +45,26 @@
           <w:rFonts w:ascii="Calibri" w:cs="Calibri" w:eastAsia="Calibri" w:hAnsi="Calibri"/>
           <w:i/>
           <w:iCs/>
-          <w:color w:val="B00000"/>
+          <w:color w:val="1A7A1A"/>
           <w:sz w:val="20"/>
           <w:szCs w:val="20"/>
         </w:rPr>
-        <w:t xml:space="preserve">REVISÃO TÉCNICA (Claude) — aguardando Revisão Jurídica (advogado) para virar v0.3. Campos entre colchetes [ ] ainda precisam ser confirmados.</w:t>
-      </w:r>
-    </w:p>
-    <w:p>
-      <w:pPr>
-        <w:spacing w:after="200"/>
-      </w:pPr>
-      <w:r>
-        <w:rPr>
-          <w:rFonts w:ascii="Calibri" w:cs="Calibri" w:eastAsia="Calibri" w:hAnsi="Calibri"/>
-          <w:b w:val="false"/>
-          <w:bCs w:val="false"/>
-          <w:sz w:val="22"/>
-          <w:szCs w:val="22"/>
-        </w:rPr>
-        <w:t xml:space="preserve">Este Contrato de Licença de Usuário Final ("EULA") é um acordo legal entre você (pessoa física ou jurídica) e Caio [SOBRENOME — CONFIRMAR], pessoa física ("Licenciante") para o uso do software Campfire Tradutor ("o Software"), incluindo suas versões para Windows (desktop) e Android (mobile).</w:t>
+        <w:t xml:space="preserve">REVISÃO JURÍDICA (Advogada) incorporada em 31/07/2026. Resta confirmar: modelo de licença (Seção 2).</w:t>
+      </w:r>
+    </w:p>
+    <w:p>
+      <w:pPr>
+        <w:spacing w:after="200"/>
+      </w:pPr>
+      <w:r>
+        <w:rPr>
+          <w:rFonts w:ascii="Calibri" w:cs="Calibri" w:eastAsia="Calibri" w:hAnsi="Calibri"/>
+          <w:b w:val="false"/>
+          <w:bCs w:val="false"/>
+          <w:sz w:val="22"/>
+          <w:szCs w:val="22"/>
+        </w:rPr>
+        <w:t xml:space="preserve">Este Contrato de Licença de Usuário Final ("EULA") é um acordo legal entre você (pessoa física ou jurídica) e Caio Fabiano da Silva Costa, pessoa física ("Licenciante") para o uso do software Campfire Tradutor ("o Software"), incluindo suas versões para Windows (desktop) e Android (mobile).</w:t>
       </w:r>
     </w:p>
     <w:p>
@@ -760,7 +760,7 @@
           <w:sz w:val="22"/>
           <w:szCs w:val="22"/>
         </w:rPr>
-        <w:t xml:space="preserve">Este EULA é regido pelas leis da República Federativa do Brasil, com foro eleito em [cidade/comarca — CONFIRMAR].</w:t>
+        <w:t xml:space="preserve">Este EULA é regido pelas leis da República Federativa do Brasil, com foro eleito na comarca do Cabo de Santo Agostinho/PE.</w:t>
       </w:r>
     </w:p>
     <w:p>

</xml_diff>

<commit_message>
docs: resolve último bloqueante da EULA — modelo de negócio freemium
Seção 2 da EULA agora afirma licença gratuita com ressalva de que o
Desenvolvedor pode introduzir funcionalidades pagas (freemium) no futuro,
sem afetar retroativamente o uso gratuito já disponibilizado. Decisão de
negócio confirmada pelo Caio em 2026-08-05, alinhada ao roadmap (servidor
próprio via Pix/cartão). Com isso, os 5 documentos jurídicos não têm mais
nenhum campo bloqueante em aberto — só a Revisão Jurídica final de quem
ainda está em v0.2.
</commit_message>
<xml_diff>
--- a/Políticas/EULA_Campfire_Tradutor.docx
+++ b/Políticas/EULA_Campfire_Tradutor.docx
@@ -216,7 +216,7 @@
           <w:sz w:val="22"/>
           <w:szCs w:val="22"/>
         </w:rPr>
-        <w:t xml:space="preserve">Sujeito aos termos deste EULA, o Licenciante concede a você uma licença [gratuita — CONFIRMAR modelo de negócio, ex: freemium], pessoal, não exclusiva, intransferível e revogável para instalar e usar o Software </w:t>
+        <w:t xml:space="preserve">Sujeito aos termos deste EULA, o Licenciante concede a você uma licença gratuita, pessoal, não exclusiva, intransferível e revogável para instalar e usar o Software </w:t>
       </w:r>
       <w:r>
         <w:rPr>
@@ -237,6 +237,21 @@
           <w:szCs w:val="22"/>
         </w:rPr>
         <w:t xml:space="preserve"> em dispositivos de sua propriedade ou controle, exclusivamente para os fins descritos na documentação do Software.</w:t>
+      </w:r>
+    </w:p>
+    <w:p>
+      <w:pPr>
+        <w:spacing w:after="200"/>
+      </w:pPr>
+      <w:r>
+        <w:rPr>
+          <w:rFonts w:ascii="Calibri" w:cs="Calibri" w:eastAsia="Calibri" w:hAnsi="Calibri"/>
+          <w:b w:val="false"/>
+          <w:bCs w:val="false"/>
+          <w:sz w:val="22"/>
+          <w:szCs w:val="22"/>
+        </w:rPr>
+        <w:t xml:space="preserve">O Licenciante poderá, no futuro, introduzir funcionalidades ou serviços adicionais pagos (modelo freemium) — por exemplo, um servidor próprio opcional. Nesse caso, os termos aplicáveis a essas novas funcionalidades pagas serão informados previamente e não afetarão retroativamente o uso das funcionalidades gratuitas já disponibilizadas até então.</w:t>
       </w:r>
     </w:p>
     <w:p>

</xml_diff>

<commit_message>
fix: alinha EULA e Aviso na proteção de marca + inclui AlienRaccoon Entertainment
A EULA (Seção 7) ainda tinha a mesma redação de "titularidade exclusiva"
já corrigida no Aviso de Direitos Autorais — mesma inconsistência interna:
afirmar propriedade de marca não registrada como fato consumado. Alinhadas
as duas seções com a mesma redação juridicamente precisa (usados e
reivindicados, propriedade plena condicionada ao registro no INPI, art. 129
da Lei 9.279/1996).

Ambas as seções agora também citam a marca "AlienRaccoon Entertainment",
já que tratam de proteção de marca/identidade visual de forma geral.
</commit_message>
<xml_diff>
--- a/Políticas/EULA_Campfire_Tradutor.docx
+++ b/Políticas/EULA_Campfire_Tradutor.docx
@@ -596,7 +596,7 @@
           <w:sz w:val="22"/>
           <w:szCs w:val="22"/>
         </w:rPr>
-        <w:t xml:space="preserve">O nome "Campfire Tradutor", seu logotipo e sua identidade visual </w:t>
+        <w:t xml:space="preserve">O nome "Campfire Tradutor", a marca "AlienRaccoon Entertainment" sob a qual o Licenciante atua, seus logotipos e identidade visual </w:t>
       </w:r>
       <w:r>
         <w:rPr>
@@ -616,7 +616,7 @@
           <w:sz w:val="22"/>
           <w:szCs w:val="22"/>
         </w:rPr>
-        <w:t xml:space="preserve"> estão cobertos pela licença MIT do código-fonte e permanecem de titularidade exclusiva do Licenciante. Versões modificadas do código-fonte (forks), ainda que legítimas sob a licença MIT, não podem usar o nome "Campfire Tradutor" nem elementos de sua identidade visual de forma que sugira ser o produto oficial ou que cause confusão quanto à origem. Ver também o Aviso de Direitos Autorais.</w:t>
+        <w:t xml:space="preserve"> estão cobertos pela licença MIT do código-fonte. Esses elementos são usados e reivindicados pelo Licenciante, que pretende formalizar essa proteção por meio de registro junto ao INPI — até a conclusão desse registro, a proteção decorre do uso e da eventual precedência de que trata o art. 129, §1º, da Lei nº 9.279/1996 (Lei da Propriedade Industrial), já que a propriedade plena da marca só se adquire com o registro validamente expedido (art. 129, caput, da mesma lei). Versões modificadas do código-fonte (forks), ainda que legítimas sob a licença MIT, não podem usar esses nomes nem elementos da identidade visual de forma que sugira ser o produto oficial ou que cause confusão quanto à origem. Ver também o Aviso de Direitos Autorais.</w:t>
       </w:r>
     </w:p>
     <w:p>

</xml_diff>